<commit_message>
Rerun Tensity CMA with upgraded assumptions
</commit_message>
<xml_diff>
--- a/Project Rooms/CMA Report/outputs/4121-tensity-cma-report.docx
+++ b/Project Rooms/CMA Report/outputs/4121-tensity-cma-report.docx
@@ -73,7 +73,7 @@
         <w:t>Valuation Premise:</w:t>
       </w:r>
       <w:r>
-        <w:t xml:space="preserve"> Preliminary public-data range for workflow testing only; final use requires MLS, county record, and condition verification.</w:t>
+        <w:t xml:space="preserve"> Upgraded-condition rerun using Wes-provided assumptions; final use requires MLS, county record, photo, and condition verification.</w:t>
       </w:r>
     </w:p>
     <w:p>
@@ -89,7 +89,7 @@
         <w:pStyle w:val="Normal"/>
       </w:pPr>
       <w:r>
-        <w:t>Based on the public data already assembled in the CMA project room, the most useful current signals cluster around a low-$300,000 working value for an average-condition property comparable to nearby Tensity Drive homes. The preliminary public-data midpoint for workflow testing is $305,000.</w:t>
+        <w:t>Based on the public data already assembled in the CMA project room and Wes-provided upgraded-condition assumptions, the revised working indication is above the prior average-condition range. The upgraded-condition public-data midpoint for workflow testing is $325,000.</w:t>
       </w:r>
     </w:p>
     <w:p>
@@ -100,10 +100,10 @@
         <w:rPr>
           <w:b/>
         </w:rPr>
-        <w:t>Preliminary public-data ranges:</w:t>
-      </w:r>
-      <w:r>
-        <w:t xml:space="preserve"> Conservative/as-is range of $285,000 to $300,000; average-condition market range of $295,000 to $315,000; prototype midpoint of $305,000.</w:t>
+        <w:t>Revised public-data ranges:</w:t>
+      </w:r>
+      <w:r>
+        <w:t xml:space="preserve"> Conservative/as-is range of $285,000 to $300,000; average-condition market range of $295,000 to $315,000; upgraded-condition range of $315,000 to $335,000; prototype midpoint of $325,000.</w:t>
       </w:r>
     </w:p>
     <w:p>
@@ -119,7 +119,7 @@
         <w:pStyle w:val="Normal"/>
       </w:pPr>
       <w:r>
-        <w:t>This report was prepared from public web sources only. It is not an appraisal, broker price opinion, or final market recommendation. Before this report is used for pricing, lending, acquisition, resale, or underwriting, the file should be updated with MLS closed-sale data, Wake County property records, current subject photos, and verified property condition.</w:t>
+        <w:t>This report was prepared from public web sources plus user-provided property assumptions. It is not an appraisal, broker price opinion, or final market recommendation. Before this report is used for pricing, lending, acquisition, resale, or underwriting, the file should be updated with MLS closed-sale data, Wake County property records, current subject photos, and verified property condition.</w:t>
       </w:r>
     </w:p>
     <w:p>
@@ -447,6 +447,59 @@
       <w:pPr>
         <w:spacing w:after="120"/>
       </w:pPr>
+    </w:p>
+    <w:p>
+      <w:pPr>
+        <w:pStyle w:val="Heading1"/>
+      </w:pPr>
+      <w:r>
+        <w:t>User-Provided Rerun Assumptions</w:t>
+      </w:r>
+    </w:p>
+    <w:p>
+      <w:pPr>
+        <w:pStyle w:val="Normal"/>
+        <w:ind w:left="720" w:hanging="360"/>
+      </w:pPr>
+      <w:r>
+        <w:t>- House is newly upgraded.</w:t>
+      </w:r>
+    </w:p>
+    <w:p>
+      <w:pPr>
+        <w:pStyle w:val="Normal"/>
+        <w:ind w:left="720" w:hanging="360"/>
+      </w:pPr>
+      <w:r>
+        <w:t>- Back yard includes two large storage buildings.</w:t>
+      </w:r>
+    </w:p>
+    <w:p>
+      <w:pPr>
+        <w:pStyle w:val="Normal"/>
+        <w:ind w:left="720" w:hanging="360"/>
+      </w:pPr>
+      <w:r>
+        <w:t>- Back yard is fully fenced.</w:t>
+      </w:r>
+    </w:p>
+    <w:p>
+      <w:pPr>
+        <w:pStyle w:val="Normal"/>
+        <w:ind w:left="720" w:hanging="360"/>
+      </w:pPr>
+      <w:r>
+        <w:t>- Property has a paver covered deck.</w:t>
+      </w:r>
+    </w:p>
+    <w:p>
+      <w:pPr>
+        <w:pStyle w:val="Normal"/>
+        <w:ind w:left="720" w:hanging="360"/>
+      </w:pPr>
+      <w:r>
+        <w:t>- Property has 3 parking spaces.</w:t>
+      </w:r>
     </w:p>
     <w:p>
       <w:pPr>
@@ -984,7 +1037,7 @@
         <w:pStyle w:val="Normal"/>
       </w:pPr>
       <w:r>
-        <w:t>The public-data signals support a preliminary average-condition market range of approximately $295,000 to $315,000. The subject Redfin estimate, the 4145 Tensity sale, and the 4236 Tensity sale all point toward a low-$300,000 working value before any condition-specific adjustment.</w:t>
+        <w:t>The public-data signals support a prior average-condition range of approximately $295,000 to $315,000. Wes-provided assumptions indicate above-average marketability versus that original prototype: newly upgraded condition, two large storage buildings, a fully fenced back yard, a paver covered deck, and 3 parking spaces.</w:t>
       </w:r>
     </w:p>
     <w:p>
@@ -992,7 +1045,7 @@
         <w:pStyle w:val="Normal"/>
       </w:pPr>
       <w:r>
-        <w:t>The active/value-add signal at 4221 Tensity Dr should be treated as an as-is pressure signal rather than a stabilized value indicator until MLS photos, property condition, concessions, and sale terms are verified.</w:t>
+        <w:t>Using those assumptions, the revised upgraded-condition working range is $315,000 to $335,000, with a prototype midpoint of $325,000. This adjustment is judgment-based because the current source set does not include paired MLS sales isolating the value of the upgraded condition and exterior/storage/parking features.</w:t>
       </w:r>
     </w:p>
     <w:p>
@@ -1211,7 +1264,7 @@
               <w:spacing w:after="60"/>
             </w:pPr>
             <w:r>
-              <w:t>Confirm subject repairs, updates, occupancy, and current condition.</w:t>
+              <w:t>Confirm subject upgrades, two storage buildings, fenced yard, paver covered deck, 3 parking spaces, and occupancy.</w:t>
             </w:r>
           </w:p>
         </w:tc>
@@ -1294,7 +1347,7 @@
         <w:pStyle w:val="Normal"/>
       </w:pPr>
       <w:r>
-        <w:t>This formal report was created from the existing CMA project-room output: Project Rooms/CMA Report/outputs/4121-tensity-public-data-cma-prototype.md. Public-source notes are maintained separately in Project Rooms/CMA Report/sources/public-web-source-notes.md.</w:t>
+        <w:t>This formal report was rerun from the existing CMA project-room output and valuation notes in Project Rooms/CMA Report. Public-source notes are maintained in Project Rooms/CMA Report/sources/public-web-source-notes.md. User-provided upgraded-condition assumptions were added on June 5, 2026.</w:t>
       </w:r>
     </w:p>
     <w:sectPr>
@@ -1416,20 +1469,5 @@
       <w:sz w:val="32"/>
     </w:rPr>
   </w:style>
-  <w:style w:type="paragraph" w:styleId="Heading2">
-    <w:name w:val="heading 2"/>
-    <w:basedOn w:val="Normal"/>
-    <w:next w:val="Normal"/>
-    <w:pPr>
-      <w:keepNext/>
-      <w:spacing w:before="240" w:after="120"/>
-    </w:pPr>
-    <w:rPr>
-      <w:rFonts w:ascii="Calibri" w:hAnsi="Calibri"/>
-      <w:b/>
-      <w:color w:val="2E74B5"/>
-      <w:sz w:val="26"/>
-    </w:rPr>
-  </w:style>
 </w:styles>
 </file>
</xml_diff>

<commit_message>
Depersonalize CMA report owner assumptions
</commit_message>
<xml_diff>
--- a/Project Rooms/CMA Report/outputs/4121-tensity-cma-report.docx
+++ b/Project Rooms/CMA Report/outputs/4121-tensity-cma-report.docx
@@ -73,7 +73,7 @@
         <w:t>Valuation Premise:</w:t>
       </w:r>
       <w:r>
-        <w:t xml:space="preserve"> Upgraded-condition rerun using Wes-provided assumptions; final use requires MLS, county record, photo, and condition verification.</w:t>
+        <w:t xml:space="preserve"> Upgraded-condition rerun using Owner-provided assumptions; final use requires MLS, county record, photo, and condition verification.</w:t>
       </w:r>
     </w:p>
     <w:p>
@@ -89,7 +89,7 @@
         <w:pStyle w:val="Normal"/>
       </w:pPr>
       <w:r>
-        <w:t>Based on the public data already assembled in the CMA project room and Wes-provided upgraded-condition assumptions, the revised working indication is above the prior average-condition range. The upgraded-condition public-data midpoint for workflow testing is $325,000.</w:t>
+        <w:t>Based on the public data already assembled in the CMA project room and Owner-provided upgraded-condition assumptions, the revised working indication is above the prior average-condition range. The upgraded-condition public-data midpoint for workflow testing is $325,000.</w:t>
       </w:r>
     </w:p>
     <w:p>
@@ -1037,7 +1037,7 @@
         <w:pStyle w:val="Normal"/>
       </w:pPr>
       <w:r>
-        <w:t>The public-data signals support a prior average-condition range of approximately $295,000 to $315,000. Wes-provided assumptions indicate above-average marketability versus that original prototype: newly upgraded condition, two large storage buildings, a fully fenced back yard, a paver covered deck, and 3 parking spaces.</w:t>
+        <w:t>The public-data signals support a prior average-condition range of approximately $295,000 to $315,000. Owner-provided assumptions indicate above-average marketability versus that original prototype: newly upgraded condition, two large storage buildings, a fully fenced back yard, a paver covered deck, and 3 parking spaces.</w:t>
       </w:r>
     </w:p>
     <w:p>
@@ -1045,7 +1045,7 @@
         <w:pStyle w:val="Normal"/>
       </w:pPr>
       <w:r>
-        <w:t>Using those assumptions, the revised upgraded-condition working range is $315,000 to $335,000, with a prototype midpoint of $325,000. This adjustment is judgment-based because the current source set does not include paired MLS sales isolating the value of the upgraded condition and exterior/storage/parking features.</w:t>
+        <w:t>Using those Owner-provided assumptions, the revised upgraded-condition working range is $315,000 to $335,000, with a prototype midpoint of $325,000. This adjustment is judgment-based because the current source set does not include paired MLS sales isolating the value of the upgraded condition and exterior/storage/parking features.</w:t>
       </w:r>
     </w:p>
     <w:p>

</xml_diff>